<commit_message>
S1-CL1: realign all 15 slide decks to the AT2/AT3 workbooks; add AT2 task 17 (shared responsibility); move PC 2.4 to compute
Co-Authored-By: Claude Fable 5 <noreply@anthropic.com>
</commit_message>
<xml_diff>
--- a/S1-CL1-Cloud-Design-Build/delivery/practice/AT2-Practice-Build-Run-Sheet.docx
+++ b/S1-CL1-Cloud-Design-Build/delivery/practice/AT2-Practice-Build-Run-Sheet.docx
@@ -114,7 +114,7 @@
           <w:i w:val="0"/>
           <w:sz w:val="21"/>
         </w:rPr>
-        <w:t>This is practice. Nothing here is marked, and nothing you build here is submitted. It is the same shape of work as your assessment, on a different system with different settings, so that working through it teaches you the moves without handing you the answers.</w:t>
+        <w:t>This is practice. Nothing here is assessed, and nothing you build here is submitted. It is the same shape of work as your assessment, on a different system with different settings, so that working through it teaches you the moves without handing you the answers.</w:t>
       </w:r>
     </w:p>
     <w:p>
@@ -148,7 +148,7 @@
           <w:i w:val="0"/>
           <w:sz w:val="21"/>
         </w:rPr>
-        <w:t>Take a screenshot at the end of each task even though nobody is marking them. In the assessment you will need one per task, and building the habit here is the point.</w:t>
+        <w:t>Take a screenshot at the end of each task even though this exercise is not assessed. In the assessment you will need one per task, and building the habit here is the point.</w:t>
       </w:r>
     </w:p>
     <w:p>

</xml_diff>